<commit_message>
added ai generation of feedback keeping old manual method
</commit_message>
<xml_diff>
--- a/BTEC-Assessment-Record-TemplateJinja.docx
+++ b/BTEC-Assessment-Record-TemplateJinja.docx
@@ -26,8 +26,8 @@
       </w:tblPr>
       <w:tblGrid>
         <w:gridCol w:w="1236"/>
-        <w:gridCol w:w="1236"/>
-        <w:gridCol w:w="2693"/>
+        <w:gridCol w:w="2795"/>
+        <w:gridCol w:w="1134"/>
         <w:gridCol w:w="993"/>
         <w:gridCol w:w="1559"/>
         <w:gridCol w:w="303"/>
@@ -137,7 +137,7 @@
         </w:trPr>
         <w:tc>
           <w:tcPr>
-            <w:tcW w:w="2472" w:type="dxa"/>
+            <w:tcW w:w="4031" w:type="dxa"/>
             <w:gridSpan w:val="2"/>
             <w:vMerge w:val="restart"/>
             <w:tcBorders>
@@ -176,7 +176,7 @@
         </w:tc>
         <w:tc>
           <w:tcPr>
-            <w:tcW w:w="2693" w:type="dxa"/>
+            <w:tcW w:w="1134" w:type="dxa"/>
             <w:vMerge w:val="restart"/>
             <w:tcBorders>
               <w:top w:val="dashSmallGap" w:sz="4" w:space="0" w:color="5B9BD5" w:themeColor="accent1"/>
@@ -299,7 +299,7 @@
         </w:trPr>
         <w:tc>
           <w:tcPr>
-            <w:tcW w:w="2472" w:type="dxa"/>
+            <w:tcW w:w="4031" w:type="dxa"/>
             <w:gridSpan w:val="2"/>
             <w:vMerge/>
             <w:tcMar>
@@ -322,7 +322,7 @@
         </w:tc>
         <w:tc>
           <w:tcPr>
-            <w:tcW w:w="2693" w:type="dxa"/>
+            <w:tcW w:w="1134" w:type="dxa"/>
             <w:vMerge/>
             <w:vAlign w:val="center"/>
           </w:tcPr>
@@ -427,7 +427,7 @@
         </w:trPr>
         <w:tc>
           <w:tcPr>
-            <w:tcW w:w="2472" w:type="dxa"/>
+            <w:tcW w:w="4031" w:type="dxa"/>
             <w:gridSpan w:val="2"/>
             <w:tcBorders>
               <w:top w:val="dashSmallGap" w:sz="4" w:space="0" w:color="5B9BD5" w:themeColor="accent1"/>
@@ -466,7 +466,7 @@
         </w:tc>
         <w:tc>
           <w:tcPr>
-            <w:tcW w:w="2693" w:type="dxa"/>
+            <w:tcW w:w="1134" w:type="dxa"/>
             <w:tcBorders>
               <w:left w:val="dashSmallGap" w:sz="4" w:space="0" w:color="5B9BD5" w:themeColor="accent1"/>
               <w:bottom w:val="dashSmallGap" w:sz="4" w:space="0" w:color="5B9BD5" w:themeColor="accent1"/>
@@ -619,7 +619,7 @@
         </w:trPr>
         <w:tc>
           <w:tcPr>
-            <w:tcW w:w="2472" w:type="dxa"/>
+            <w:tcW w:w="4031" w:type="dxa"/>
             <w:gridSpan w:val="2"/>
             <w:tcBorders>
               <w:top w:val="dashSmallGap" w:sz="4" w:space="0" w:color="5B9BD5" w:themeColor="accent1"/>
@@ -655,7 +655,7 @@
         </w:tc>
         <w:tc>
           <w:tcPr>
-            <w:tcW w:w="8222" w:type="dxa"/>
+            <w:tcW w:w="6663" w:type="dxa"/>
             <w:gridSpan w:val="5"/>
             <w:tcBorders>
               <w:top w:val="dashSmallGap" w:sz="4" w:space="0" w:color="5B9BD5" w:themeColor="accent1"/>
@@ -704,7 +704,7 @@
         </w:trPr>
         <w:tc>
           <w:tcPr>
-            <w:tcW w:w="2472" w:type="dxa"/>
+            <w:tcW w:w="4031" w:type="dxa"/>
             <w:gridSpan w:val="2"/>
             <w:tcBorders>
               <w:top w:val="dashSmallGap" w:sz="4" w:space="0" w:color="5B9BD5" w:themeColor="accent1"/>
@@ -740,7 +740,7 @@
         </w:tc>
         <w:tc>
           <w:tcPr>
-            <w:tcW w:w="2693" w:type="dxa"/>
+            <w:tcW w:w="1134" w:type="dxa"/>
             <w:tcBorders>
               <w:top w:val="dashSmallGap" w:sz="4" w:space="0" w:color="5B9BD5" w:themeColor="accent1"/>
             </w:tcBorders>
@@ -986,7 +986,7 @@
         </w:tc>
         <w:tc>
           <w:tcPr>
-            <w:tcW w:w="1236" w:type="dxa"/>
+            <w:tcW w:w="2795" w:type="dxa"/>
             <w:shd w:val="clear" w:color="auto" w:fill="F2F2F2" w:themeFill="background1" w:themeFillShade="F2"/>
             <w:tcMar>
               <w:top w:w="28" w:type="dxa"/>
@@ -1018,7 +1018,7 @@
         </w:tc>
         <w:tc>
           <w:tcPr>
-            <w:tcW w:w="8222" w:type="dxa"/>
+            <w:tcW w:w="6663" w:type="dxa"/>
             <w:gridSpan w:val="5"/>
             <w:shd w:val="clear" w:color="auto" w:fill="F2F2F2" w:themeFill="background1" w:themeFillShade="F2"/>
             <w:vAlign w:val="center"/>
@@ -1185,7 +1185,7 @@
         </w:tc>
         <w:tc>
           <w:tcPr>
-            <w:tcW w:w="1236" w:type="dxa"/>
+            <w:tcW w:w="2795" w:type="dxa"/>
             <w:tcMar>
               <w:top w:w="28" w:type="dxa"/>
               <w:bottom w:w="28" w:type="dxa"/>
@@ -1197,7 +1197,54 @@
               <w:jc w:val="center"/>
               <w:rPr>
                 <w:rFonts w:ascii="Open Sans" w:hAnsi="Open Sans" w:cs="Open Sans"/>
-                <w:color w:val="auto"/>
+              </w:rPr>
+            </w:pPr>
+            <w:r>
+              <w:rPr>
+                <w:rFonts w:ascii="Open Sans" w:hAnsi="Open Sans" w:cs="Open Sans"/>
+              </w:rPr>
+              <w:t xml:space="preserve">{{ </w:t>
+            </w:r>
+            <w:proofErr w:type="spellStart"/>
+            <w:r>
+              <w:rPr>
+                <w:rFonts w:ascii="Open Sans" w:hAnsi="Open Sans" w:cs="Open Sans"/>
+              </w:rPr>
+              <w:t>criteria.</w:t>
+            </w:r>
+            <w:r>
+              <w:rPr>
+                <w:rFonts w:ascii="Open Sans" w:hAnsi="Open Sans" w:cs="Open Sans"/>
+              </w:rPr>
+              <w:t>criteriaAchieved</w:t>
+            </w:r>
+            <w:proofErr w:type="spellEnd"/>
+            <w:r>
+              <w:rPr>
+                <w:rFonts w:ascii="Open Sans" w:hAnsi="Open Sans" w:cs="Open Sans"/>
+              </w:rPr>
+              <w:t xml:space="preserve"> </w:t>
+            </w:r>
+            <w:bookmarkStart w:id="0" w:name="_GoBack"/>
+            <w:bookmarkEnd w:id="0"/>
+            <w:r>
+              <w:rPr>
+                <w:rFonts w:ascii="Open Sans" w:hAnsi="Open Sans" w:cs="Open Sans"/>
+              </w:rPr>
+              <w:t>}}</w:t>
+            </w:r>
+          </w:p>
+        </w:tc>
+        <w:tc>
+          <w:tcPr>
+            <w:tcW w:w="6663" w:type="dxa"/>
+            <w:gridSpan w:val="5"/>
+            <w:vAlign w:val="center"/>
+          </w:tcPr>
+          <w:p>
+            <w:pPr>
+              <w:rPr>
+                <w:rFonts w:ascii="Open Sans" w:hAnsi="Open Sans" w:cs="Open Sans"/>
               </w:rPr>
             </w:pPr>
             <w:proofErr w:type="gramStart"/>
@@ -1219,56 +1266,13 @@
               <w:rPr>
                 <w:rFonts w:ascii="Open Sans" w:hAnsi="Open Sans" w:cs="Open Sans"/>
               </w:rPr>
-              <w:t>.achieved</w:t>
-            </w:r>
-            <w:proofErr w:type="spellEnd"/>
-            <w:r>
-              <w:rPr>
-                <w:rFonts w:ascii="Open Sans" w:hAnsi="Open Sans" w:cs="Open Sans"/>
-              </w:rPr>
-              <w:t xml:space="preserve"> }}</w:t>
-            </w:r>
-          </w:p>
-        </w:tc>
-        <w:tc>
-          <w:tcPr>
-            <w:tcW w:w="8222" w:type="dxa"/>
-            <w:gridSpan w:val="5"/>
-            <w:vAlign w:val="center"/>
-          </w:tcPr>
-          <w:p>
-            <w:pPr>
-              <w:rPr>
-                <w:rFonts w:ascii="Open Sans" w:hAnsi="Open Sans" w:cs="Open Sans"/>
-                <w:color w:val="auto"/>
-              </w:rPr>
-            </w:pPr>
-            <w:proofErr w:type="gramStart"/>
-            <w:r>
-              <w:rPr>
-                <w:rFonts w:ascii="Open Sans" w:hAnsi="Open Sans" w:cs="Open Sans"/>
-              </w:rPr>
-              <w:t xml:space="preserve">{{ </w:t>
-            </w:r>
-            <w:proofErr w:type="spellStart"/>
-            <w:r>
-              <w:rPr>
-                <w:rFonts w:ascii="Open Sans" w:hAnsi="Open Sans" w:cs="Open Sans"/>
-              </w:rPr>
-              <w:t>criteria</w:t>
-            </w:r>
-            <w:proofErr w:type="gramEnd"/>
-            <w:r>
-              <w:rPr>
-                <w:rFonts w:ascii="Open Sans" w:hAnsi="Open Sans" w:cs="Open Sans"/>
-              </w:rPr>
               <w:t>.</w:t>
             </w:r>
             <w:r>
               <w:rPr>
                 <w:rFonts w:ascii="Open Sans" w:hAnsi="Open Sans" w:cs="Open Sans"/>
               </w:rPr>
-              <w:t>marked_criteria_description</w:t>
+              <w:t>assessmentComment</w:t>
             </w:r>
             <w:proofErr w:type="spellEnd"/>
             <w:r>
@@ -1330,7 +1334,7 @@
         </w:tc>
         <w:tc>
           <w:tcPr>
-            <w:tcW w:w="1236" w:type="dxa"/>
+            <w:tcW w:w="2795" w:type="dxa"/>
             <w:tcMar>
               <w:top w:w="28" w:type="dxa"/>
               <w:bottom w:w="28" w:type="dxa"/>
@@ -1349,7 +1353,7 @@
         </w:tc>
         <w:tc>
           <w:tcPr>
-            <w:tcW w:w="8222" w:type="dxa"/>
+            <w:tcW w:w="6663" w:type="dxa"/>
             <w:gridSpan w:val="5"/>
             <w:vAlign w:val="center"/>
           </w:tcPr>
@@ -1386,6 +1390,45 @@
         </w:tc>
         <w:tc>
           <w:tcPr>
+            <w:tcW w:w="2795" w:type="dxa"/>
+            <w:tcMar>
+              <w:top w:w="28" w:type="dxa"/>
+              <w:bottom w:w="28" w:type="dxa"/>
+            </w:tcMar>
+            <w:vAlign w:val="center"/>
+          </w:tcPr>
+          <w:p>
+            <w:pPr>
+              <w:jc w:val="center"/>
+              <w:rPr>
+                <w:rFonts w:ascii="Open Sans" w:hAnsi="Open Sans" w:cs="Open Sans"/>
+                <w:color w:val="auto"/>
+              </w:rPr>
+            </w:pPr>
+          </w:p>
+        </w:tc>
+        <w:tc>
+          <w:tcPr>
+            <w:tcW w:w="6663" w:type="dxa"/>
+            <w:gridSpan w:val="5"/>
+            <w:vAlign w:val="center"/>
+          </w:tcPr>
+          <w:p>
+            <w:pPr>
+              <w:rPr>
+                <w:rFonts w:ascii="Open Sans" w:hAnsi="Open Sans" w:cs="Open Sans"/>
+                <w:color w:val="auto"/>
+              </w:rPr>
+            </w:pPr>
+          </w:p>
+        </w:tc>
+      </w:tr>
+      <w:tr>
+        <w:trPr>
+          <w:trHeight w:val="333"/>
+        </w:trPr>
+        <w:tc>
+          <w:tcPr>
             <w:tcW w:w="1236" w:type="dxa"/>
             <w:tcMar>
               <w:top w:w="28" w:type="dxa"/>
@@ -1395,6 +1438,24 @@
           </w:tcPr>
           <w:p>
             <w:pPr>
+              <w:rPr>
+                <w:rStyle w:val="normaltextrun"/>
+                <w:shd w:val="clear" w:color="auto" w:fill="FFFFFF"/>
+              </w:rPr>
+            </w:pPr>
+          </w:p>
+        </w:tc>
+        <w:tc>
+          <w:tcPr>
+            <w:tcW w:w="2795" w:type="dxa"/>
+            <w:tcMar>
+              <w:top w:w="28" w:type="dxa"/>
+              <w:bottom w:w="28" w:type="dxa"/>
+            </w:tcMar>
+            <w:vAlign w:val="center"/>
+          </w:tcPr>
+          <w:p>
+            <w:pPr>
               <w:jc w:val="center"/>
               <w:rPr>
                 <w:rFonts w:ascii="Open Sans" w:hAnsi="Open Sans" w:cs="Open Sans"/>
@@ -1405,7 +1466,178 @@
         </w:tc>
         <w:tc>
           <w:tcPr>
-            <w:tcW w:w="8222" w:type="dxa"/>
+            <w:tcW w:w="6663" w:type="dxa"/>
+            <w:gridSpan w:val="5"/>
+            <w:vAlign w:val="center"/>
+          </w:tcPr>
+          <w:p>
+            <w:pPr>
+              <w:rPr>
+                <w:rFonts w:ascii="Open Sans" w:hAnsi="Open Sans" w:cs="Open Sans"/>
+                <w:color w:val="auto"/>
+              </w:rPr>
+            </w:pPr>
+          </w:p>
+        </w:tc>
+      </w:tr>
+      <w:tr>
+        <w:trPr>
+          <w:trHeight w:val="333"/>
+        </w:trPr>
+        <w:tc>
+          <w:tcPr>
+            <w:tcW w:w="1236" w:type="dxa"/>
+            <w:tcMar>
+              <w:top w:w="28" w:type="dxa"/>
+              <w:bottom w:w="28" w:type="dxa"/>
+            </w:tcMar>
+            <w:vAlign w:val="center"/>
+          </w:tcPr>
+          <w:p>
+            <w:pPr>
+              <w:rPr>
+                <w:rStyle w:val="normaltextrun"/>
+                <w:shd w:val="clear" w:color="auto" w:fill="FFFFFF"/>
+              </w:rPr>
+            </w:pPr>
+          </w:p>
+        </w:tc>
+        <w:tc>
+          <w:tcPr>
+            <w:tcW w:w="2795" w:type="dxa"/>
+            <w:tcMar>
+              <w:top w:w="28" w:type="dxa"/>
+              <w:bottom w:w="28" w:type="dxa"/>
+            </w:tcMar>
+            <w:vAlign w:val="center"/>
+          </w:tcPr>
+          <w:p>
+            <w:pPr>
+              <w:jc w:val="center"/>
+              <w:rPr>
+                <w:rFonts w:ascii="Open Sans" w:hAnsi="Open Sans" w:cs="Open Sans"/>
+                <w:color w:val="auto"/>
+              </w:rPr>
+            </w:pPr>
+          </w:p>
+        </w:tc>
+        <w:tc>
+          <w:tcPr>
+            <w:tcW w:w="6663" w:type="dxa"/>
+            <w:gridSpan w:val="5"/>
+            <w:vAlign w:val="center"/>
+          </w:tcPr>
+          <w:p>
+            <w:pPr>
+              <w:rPr>
+                <w:rFonts w:ascii="Open Sans" w:hAnsi="Open Sans" w:cs="Open Sans"/>
+                <w:color w:val="auto"/>
+              </w:rPr>
+            </w:pPr>
+          </w:p>
+        </w:tc>
+      </w:tr>
+      <w:tr>
+        <w:trPr>
+          <w:trHeight w:val="333"/>
+        </w:trPr>
+        <w:tc>
+          <w:tcPr>
+            <w:tcW w:w="1236" w:type="dxa"/>
+            <w:tcMar>
+              <w:top w:w="28" w:type="dxa"/>
+              <w:bottom w:w="28" w:type="dxa"/>
+            </w:tcMar>
+            <w:vAlign w:val="center"/>
+          </w:tcPr>
+          <w:p>
+            <w:pPr>
+              <w:rPr>
+                <w:rStyle w:val="normaltextrun"/>
+                <w:shd w:val="clear" w:color="auto" w:fill="FFFFFF"/>
+              </w:rPr>
+            </w:pPr>
+          </w:p>
+        </w:tc>
+        <w:tc>
+          <w:tcPr>
+            <w:tcW w:w="2795" w:type="dxa"/>
+            <w:tcMar>
+              <w:top w:w="28" w:type="dxa"/>
+              <w:bottom w:w="28" w:type="dxa"/>
+            </w:tcMar>
+            <w:vAlign w:val="center"/>
+          </w:tcPr>
+          <w:p>
+            <w:pPr>
+              <w:jc w:val="center"/>
+              <w:rPr>
+                <w:rFonts w:ascii="Open Sans" w:hAnsi="Open Sans" w:cs="Open Sans"/>
+                <w:color w:val="auto"/>
+              </w:rPr>
+            </w:pPr>
+          </w:p>
+        </w:tc>
+        <w:tc>
+          <w:tcPr>
+            <w:tcW w:w="6663" w:type="dxa"/>
+            <w:gridSpan w:val="5"/>
+            <w:vAlign w:val="center"/>
+          </w:tcPr>
+          <w:p>
+            <w:pPr>
+              <w:rPr>
+                <w:rFonts w:ascii="Open Sans" w:hAnsi="Open Sans" w:cs="Open Sans"/>
+                <w:color w:val="auto"/>
+              </w:rPr>
+            </w:pPr>
+          </w:p>
+        </w:tc>
+      </w:tr>
+      <w:tr>
+        <w:trPr>
+          <w:trHeight w:val="333"/>
+        </w:trPr>
+        <w:tc>
+          <w:tcPr>
+            <w:tcW w:w="1236" w:type="dxa"/>
+            <w:tcMar>
+              <w:top w:w="28" w:type="dxa"/>
+              <w:bottom w:w="28" w:type="dxa"/>
+            </w:tcMar>
+            <w:vAlign w:val="center"/>
+          </w:tcPr>
+          <w:p>
+            <w:pPr>
+              <w:rPr>
+                <w:rStyle w:val="normaltextrun"/>
+                <w:shd w:val="clear" w:color="auto" w:fill="FFFFFF"/>
+              </w:rPr>
+            </w:pPr>
+          </w:p>
+        </w:tc>
+        <w:tc>
+          <w:tcPr>
+            <w:tcW w:w="2795" w:type="dxa"/>
+            <w:tcMar>
+              <w:top w:w="28" w:type="dxa"/>
+              <w:bottom w:w="28" w:type="dxa"/>
+            </w:tcMar>
+            <w:vAlign w:val="center"/>
+          </w:tcPr>
+          <w:p>
+            <w:pPr>
+              <w:jc w:val="center"/>
+              <w:rPr>
+                <w:rFonts w:ascii="Open Sans" w:hAnsi="Open Sans" w:cs="Open Sans"/>
+                <w:color w:val="auto"/>
+              </w:rPr>
+            </w:pPr>
+          </w:p>
+        </w:tc>
+        <w:tc>
+          <w:tcPr>
+            <w:tcW w:w="6663" w:type="dxa"/>
             <w:gridSpan w:val="5"/>
             <w:vAlign w:val="center"/>
           </w:tcPr>
@@ -1505,6 +1737,13 @@
               </w:rPr>
             </w:pPr>
           </w:p>
+          <w:p>
+            <w:pPr>
+              <w:rPr>
+                <w:rFonts w:ascii="Open Sans" w:hAnsi="Open Sans" w:cs="Open Sans"/>
+              </w:rPr>
+            </w:pPr>
+          </w:p>
         </w:tc>
       </w:tr>
       <w:tr>
@@ -1817,7 +2056,7 @@
               </w:rPr>
               <w:t xml:space="preserve">used in the work. </w:t>
             </w:r>
-            <w:ins w:id="0" w:author="Lee Shirley" w:date="2023-12-19T14:26:00Z">
+            <w:ins w:id="1" w:author="Lee Shirley" w:date="2023-12-19T14:26:00Z">
               <w:r>
                 <w:rPr>
                   <w:rFonts w:ascii="Open Sans" w:hAnsi="Open Sans" w:cs="Open Sans"/>
@@ -2894,8 +3133,6 @@
               </w:rPr>
               <w:t xml:space="preserve"> }}</w:t>
             </w:r>
-            <w:bookmarkStart w:id="1" w:name="_GoBack"/>
-            <w:bookmarkEnd w:id="1"/>
           </w:p>
         </w:tc>
       </w:tr>
@@ -3858,6 +4095,7 @@
                 <w:sz w:val="16"/>
                 <w:szCs w:val="16"/>
               </w:rPr>
+              <w:lastRenderedPageBreak/>
               <w:t xml:space="preserve">Learner Declaration - </w:t>
             </w:r>
             <w:r>
@@ -5780,7 +6018,6 @@
   <w:style w:type="character" w:default="1" w:styleId="DefaultParagraphFont">
     <w:name w:val="Default Paragraph Font"/>
     <w:uiPriority w:val="1"/>
-    <w:semiHidden/>
     <w:unhideWhenUsed/>
   </w:style>
   <w:style w:type="table" w:default="1" w:styleId="TableNormal">
@@ -6304,11 +6541,11 @@
 <file path=customXml/item2.xml><?xml version="1.0" encoding="utf-8"?>
 <p:properties xmlns:p="http://schemas.microsoft.com/office/2006/metadata/properties" xmlns:xsi="http://www.w3.org/2001/XMLSchema-instance" xmlns:pc="http://schemas.microsoft.com/office/infopath/2007/PartnerControls">
   <documentManagement>
-    <TaxCatchAll xmlns="468815d5-cb9c-47f5-a02e-1e231035b2f5" xsi:nil="true"/>
-    <lcf76f155ced4ddcb4097134ff3c332f xmlns="88ecf5b8-9820-43d8-9ca8-4b0ec3b93c38">
+    <TaxCatchAll xmlns="3b0546f9-1591-425f-a5ce-577a0197cd82" xsi:nil="true"/>
+    <lcf76f155ced4ddcb4097134ff3c332f xmlns="184593b7-ad5e-4fec-b620-657070b7e511">
       <Terms xmlns="http://schemas.microsoft.com/office/infopath/2007/PartnerControls"/>
     </lcf76f155ced4ddcb4097134ff3c332f>
-    <SharedWithUsers xmlns="468815d5-cb9c-47f5-a02e-1e231035b2f5">
+    <SharedWithUsers xmlns="3b0546f9-1591-425f-a5ce-577a0197cd82">
       <UserInfo>
         <DisplayName>Ravi Patel</DisplayName>
         <AccountId>1831</AccountId>
@@ -6340,17 +6577,15 @@
         <AccountType/>
       </UserInfo>
     </SharedWithUsers>
-    <DateModified xmlns="88ecf5b8-9820-43d8-9ca8-4b0ec3b93c38" xsi:nil="true"/>
-    <DateofModification xmlns="88ecf5b8-9820-43d8-9ca8-4b0ec3b93c38" xsi:nil="true"/>
   </documentManagement>
 </p:properties>
 </file>
 
 <file path=customXml/item3.xml><?xml version="1.0" encoding="utf-8"?>
-<ct:contentTypeSchema xmlns:ct="http://schemas.microsoft.com/office/2006/metadata/contentType" xmlns:ma="http://schemas.microsoft.com/office/2006/metadata/properties/metaAttributes" ct:_="" ma:_="" ma:contentTypeName="Document" ma:contentTypeID="0x010100843A8D5C37786B49B9B1C84B34032B24" ma:contentTypeVersion="20" ma:contentTypeDescription="Create a new document." ma:contentTypeScope="" ma:versionID="837efde7be552861d3b148f43fd3c0de">
-  <xsd:schema xmlns:xsd="http://www.w3.org/2001/XMLSchema" xmlns:xs="http://www.w3.org/2001/XMLSchema" xmlns:p="http://schemas.microsoft.com/office/2006/metadata/properties" xmlns:ns2="88ecf5b8-9820-43d8-9ca8-4b0ec3b93c38" xmlns:ns3="468815d5-cb9c-47f5-a02e-1e231035b2f5" targetNamespace="http://schemas.microsoft.com/office/2006/metadata/properties" ma:root="true" ma:fieldsID="8d82298263908599410167b8df6b4d1c" ns2:_="" ns3:_="">
-    <xsd:import namespace="88ecf5b8-9820-43d8-9ca8-4b0ec3b93c38"/>
-    <xsd:import namespace="468815d5-cb9c-47f5-a02e-1e231035b2f5"/>
+<ct:contentTypeSchema xmlns:ct="http://schemas.microsoft.com/office/2006/metadata/contentType" xmlns:ma="http://schemas.microsoft.com/office/2006/metadata/properties/metaAttributes" ct:_="" ma:_="" ma:contentTypeName="Document" ma:contentTypeID="0x0101008B7F7BC62E88274DB030B98DB86109F1" ma:contentTypeVersion="18" ma:contentTypeDescription="Create a new document." ma:contentTypeScope="" ma:versionID="af5224957d712b2c4c6eb0a37b955b27">
+  <xsd:schema xmlns:xsd="http://www.w3.org/2001/XMLSchema" xmlns:xs="http://www.w3.org/2001/XMLSchema" xmlns:p="http://schemas.microsoft.com/office/2006/metadata/properties" xmlns:ns2="184593b7-ad5e-4fec-b620-657070b7e511" xmlns:ns3="3b0546f9-1591-425f-a5ce-577a0197cd82" targetNamespace="http://schemas.microsoft.com/office/2006/metadata/properties" ma:root="true" ma:fieldsID="eee6da7a7debdcc4afc87b42161348c0" ns2:_="" ns3:_="">
+    <xsd:import namespace="184593b7-ad5e-4fec-b620-657070b7e511"/>
+    <xsd:import namespace="3b0546f9-1591-425f-a5ce-577a0197cd82"/>
     <xsd:element name="properties">
       <xsd:complexType>
         <xsd:sequence>
@@ -6361,21 +6596,18 @@
                 <xsd:element ref="ns2:MediaServiceFastMetadata" minOccurs="0"/>
                 <xsd:element ref="ns2:MediaServiceAutoKeyPoints" minOccurs="0"/>
                 <xsd:element ref="ns2:MediaServiceKeyPoints" minOccurs="0"/>
-                <xsd:element ref="ns3:SharedWithUsers" minOccurs="0"/>
-                <xsd:element ref="ns3:SharedWithDetails" minOccurs="0"/>
-                <xsd:element ref="ns2:DateofModification" minOccurs="0"/>
-                <xsd:element ref="ns2:MediaServiceAutoTags" minOccurs="0"/>
                 <xsd:element ref="ns2:MediaServiceOCR" minOccurs="0"/>
                 <xsd:element ref="ns2:MediaServiceGenerationTime" minOccurs="0"/>
                 <xsd:element ref="ns2:MediaServiceEventHashCode" minOccurs="0"/>
-                <xsd:element ref="ns2:MediaServiceDateTaken" minOccurs="0"/>
-                <xsd:element ref="ns2:DateModified" minOccurs="0"/>
-                <xsd:element ref="ns2:MediaServiceLocation" minOccurs="0"/>
+                <xsd:element ref="ns3:SharedWithUsers" minOccurs="0"/>
+                <xsd:element ref="ns3:SharedWithDetails" minOccurs="0"/>
                 <xsd:element ref="ns2:MediaLengthInSeconds" minOccurs="0"/>
                 <xsd:element ref="ns2:lcf76f155ced4ddcb4097134ff3c332f" minOccurs="0"/>
                 <xsd:element ref="ns3:TaxCatchAll" minOccurs="0"/>
+                <xsd:element ref="ns2:MediaServiceDateTaken" minOccurs="0"/>
+                <xsd:element ref="ns2:MediaServiceSearchProperties" minOccurs="0"/>
                 <xsd:element ref="ns2:MediaServiceObjectDetectorVersions" minOccurs="0"/>
-                <xsd:element ref="ns2:MediaServiceSearchProperties" minOccurs="0"/>
+                <xsd:element ref="ns2:MediaServiceLocation" minOccurs="0"/>
               </xsd:all>
             </xsd:complexType>
           </xsd:element>
@@ -6383,7 +6615,7 @@
       </xsd:complexType>
     </xsd:element>
   </xsd:schema>
-  <xsd:schema xmlns:xsd="http://www.w3.org/2001/XMLSchema" xmlns:xs="http://www.w3.org/2001/XMLSchema" xmlns:dms="http://schemas.microsoft.com/office/2006/documentManagement/types" xmlns:pc="http://schemas.microsoft.com/office/infopath/2007/PartnerControls" targetNamespace="88ecf5b8-9820-43d8-9ca8-4b0ec3b93c38" elementFormDefault="qualified">
+  <xsd:schema xmlns:xsd="http://www.w3.org/2001/XMLSchema" xmlns:xs="http://www.w3.org/2001/XMLSchema" xmlns:dms="http://schemas.microsoft.com/office/2006/documentManagement/types" xmlns:pc="http://schemas.microsoft.com/office/infopath/2007/PartnerControls" targetNamespace="184593b7-ad5e-4fec-b620-657070b7e511" elementFormDefault="qualified">
     <xsd:import namespace="http://schemas.microsoft.com/office/2006/documentManagement/types"/>
     <xsd:import namespace="http://schemas.microsoft.com/office/infopath/2007/PartnerControls"/>
     <xsd:element name="MediaServiceMetadata" ma:index="8" nillable="true" ma:displayName="MediaServiceMetadata" ma:hidden="true" ma:internalName="MediaServiceMetadata" ma:readOnly="true">
@@ -6408,75 +6640,60 @@
         </xsd:restriction>
       </xsd:simpleType>
     </xsd:element>
-    <xsd:element name="DateofModification" ma:index="14" nillable="true" ma:displayName="Date of Modification" ma:format="DateOnly" ma:internalName="DateofModification">
-      <xsd:simpleType>
-        <xsd:restriction base="dms:DateTime"/>
-      </xsd:simpleType>
-    </xsd:element>
-    <xsd:element name="MediaServiceAutoTags" ma:index="15" nillable="true" ma:displayName="Tags" ma:internalName="MediaServiceAutoTags" ma:readOnly="true">
-      <xsd:simpleType>
-        <xsd:restriction base="dms:Text"/>
-      </xsd:simpleType>
-    </xsd:element>
-    <xsd:element name="MediaServiceOCR" ma:index="16" nillable="true" ma:displayName="Extracted Text" ma:internalName="MediaServiceOCR" ma:readOnly="true">
+    <xsd:element name="MediaServiceOCR" ma:index="12" nillable="true" ma:displayName="Extracted Text" ma:internalName="MediaServiceOCR" ma:readOnly="true">
       <xsd:simpleType>
         <xsd:restriction base="dms:Note">
           <xsd:maxLength value="255"/>
         </xsd:restriction>
       </xsd:simpleType>
     </xsd:element>
-    <xsd:element name="MediaServiceGenerationTime" ma:index="17" nillable="true" ma:displayName="MediaServiceGenerationTime" ma:hidden="true" ma:internalName="MediaServiceGenerationTime" ma:readOnly="true">
+    <xsd:element name="MediaServiceGenerationTime" ma:index="13" nillable="true" ma:displayName="MediaServiceGenerationTime" ma:hidden="true" ma:internalName="MediaServiceGenerationTime" ma:readOnly="true">
       <xsd:simpleType>
         <xsd:restriction base="dms:Text"/>
       </xsd:simpleType>
     </xsd:element>
-    <xsd:element name="MediaServiceEventHashCode" ma:index="18" nillable="true" ma:displayName="MediaServiceEventHashCode" ma:hidden="true" ma:internalName="MediaServiceEventHashCode" ma:readOnly="true">
+    <xsd:element name="MediaServiceEventHashCode" ma:index="14" nillable="true" ma:displayName="MediaServiceEventHashCode" ma:hidden="true" ma:internalName="MediaServiceEventHashCode" ma:readOnly="true">
       <xsd:simpleType>
         <xsd:restriction base="dms:Text"/>
       </xsd:simpleType>
     </xsd:element>
-    <xsd:element name="MediaServiceDateTaken" ma:index="19" nillable="true" ma:displayName="MediaServiceDateTaken" ma:hidden="true" ma:internalName="MediaServiceDateTaken" ma:readOnly="true">
-      <xsd:simpleType>
-        <xsd:restriction base="dms:Text"/>
-      </xsd:simpleType>
-    </xsd:element>
-    <xsd:element name="DateModified" ma:index="20" nillable="true" ma:displayName="Date Modified" ma:format="DateOnly" ma:internalName="DateModified">
-      <xsd:simpleType>
-        <xsd:restriction base="dms:DateTime"/>
-      </xsd:simpleType>
-    </xsd:element>
-    <xsd:element name="MediaServiceLocation" ma:index="21" nillable="true" ma:displayName="Location" ma:internalName="MediaServiceLocation" ma:readOnly="true">
-      <xsd:simpleType>
-        <xsd:restriction base="dms:Text"/>
-      </xsd:simpleType>
-    </xsd:element>
-    <xsd:element name="MediaLengthInSeconds" ma:index="22" nillable="true" ma:displayName="Length (seconds)" ma:internalName="MediaLengthInSeconds" ma:readOnly="true">
+    <xsd:element name="MediaLengthInSeconds" ma:index="17" nillable="true" ma:displayName="Length (seconds)" ma:internalName="MediaLengthInSeconds" ma:readOnly="true">
       <xsd:simpleType>
         <xsd:restriction base="dms:Unknown"/>
       </xsd:simpleType>
     </xsd:element>
-    <xsd:element name="lcf76f155ced4ddcb4097134ff3c332f" ma:index="24" nillable="true" ma:taxonomy="true" ma:internalName="lcf76f155ced4ddcb4097134ff3c332f" ma:taxonomyFieldName="MediaServiceImageTags" ma:displayName="Image Tags" ma:readOnly="false" ma:fieldId="{5cf76f15-5ced-4ddc-b409-7134ff3c332f}" ma:taxonomyMulti="true" ma:sspId="46342d94-4a90-4c9b-8c88-cb4c8647e98f" ma:termSetId="09814cd3-568e-fe90-9814-8d621ff8fb84" ma:anchorId="fba54fb3-c3e1-fe81-a776-ca4b69148c4d" ma:open="true" ma:isKeyword="false">
+    <xsd:element name="lcf76f155ced4ddcb4097134ff3c332f" ma:index="19" nillable="true" ma:taxonomy="true" ma:internalName="lcf76f155ced4ddcb4097134ff3c332f" ma:taxonomyFieldName="MediaServiceImageTags" ma:displayName="Image Tags" ma:readOnly="false" ma:fieldId="{5cf76f15-5ced-4ddc-b409-7134ff3c332f}" ma:taxonomyMulti="true" ma:sspId="b8a6fc9d-fa20-4e1a-b911-78d429d48e32" ma:termSetId="09814cd3-568e-fe90-9814-8d621ff8fb84" ma:anchorId="fba54fb3-c3e1-fe81-a776-ca4b69148c4d" ma:open="true" ma:isKeyword="false">
       <xsd:complexType>
         <xsd:sequence>
           <xsd:element ref="pc:Terms" minOccurs="0" maxOccurs="1"/>
         </xsd:sequence>
       </xsd:complexType>
     </xsd:element>
-    <xsd:element name="MediaServiceObjectDetectorVersions" ma:index="26" nillable="true" ma:displayName="MediaServiceObjectDetectorVersions" ma:hidden="true" ma:indexed="true" ma:internalName="MediaServiceObjectDetectorVersions" ma:readOnly="true">
+    <xsd:element name="MediaServiceDateTaken" ma:index="21" nillable="true" ma:displayName="MediaServiceDateTaken" ma:hidden="true" ma:internalName="MediaServiceDateTaken" ma:readOnly="true">
       <xsd:simpleType>
         <xsd:restriction base="dms:Text"/>
       </xsd:simpleType>
     </xsd:element>
-    <xsd:element name="MediaServiceSearchProperties" ma:index="27" nillable="true" ma:displayName="MediaServiceSearchProperties" ma:hidden="true" ma:internalName="MediaServiceSearchProperties" ma:readOnly="true">
+    <xsd:element name="MediaServiceSearchProperties" ma:index="22" nillable="true" ma:displayName="MediaServiceSearchProperties" ma:hidden="true" ma:internalName="MediaServiceSearchProperties" ma:readOnly="true">
       <xsd:simpleType>
         <xsd:restriction base="dms:Note"/>
       </xsd:simpleType>
     </xsd:element>
+    <xsd:element name="MediaServiceObjectDetectorVersions" ma:index="23" nillable="true" ma:displayName="MediaServiceObjectDetectorVersions" ma:hidden="true" ma:indexed="true" ma:internalName="MediaServiceObjectDetectorVersions" ma:readOnly="true">
+      <xsd:simpleType>
+        <xsd:restriction base="dms:Text"/>
+      </xsd:simpleType>
+    </xsd:element>
+    <xsd:element name="MediaServiceLocation" ma:index="24" nillable="true" ma:displayName="Location" ma:indexed="true" ma:internalName="MediaServiceLocation" ma:readOnly="true">
+      <xsd:simpleType>
+        <xsd:restriction base="dms:Text"/>
+      </xsd:simpleType>
+    </xsd:element>
   </xsd:schema>
-  <xsd:schema xmlns:xsd="http://www.w3.org/2001/XMLSchema" xmlns:xs="http://www.w3.org/2001/XMLSchema" xmlns:dms="http://schemas.microsoft.com/office/2006/documentManagement/types" xmlns:pc="http://schemas.microsoft.com/office/infopath/2007/PartnerControls" targetNamespace="468815d5-cb9c-47f5-a02e-1e231035b2f5" elementFormDefault="qualified">
+  <xsd:schema xmlns:xsd="http://www.w3.org/2001/XMLSchema" xmlns:xs="http://www.w3.org/2001/XMLSchema" xmlns:dms="http://schemas.microsoft.com/office/2006/documentManagement/types" xmlns:pc="http://schemas.microsoft.com/office/infopath/2007/PartnerControls" targetNamespace="3b0546f9-1591-425f-a5ce-577a0197cd82" elementFormDefault="qualified">
     <xsd:import namespace="http://schemas.microsoft.com/office/2006/documentManagement/types"/>
     <xsd:import namespace="http://schemas.microsoft.com/office/infopath/2007/PartnerControls"/>
-    <xsd:element name="SharedWithUsers" ma:index="12" nillable="true" ma:displayName="Shared With" ma:internalName="SharedWithUsers" ma:readOnly="true">
+    <xsd:element name="SharedWithUsers" ma:index="15" nillable="true" ma:displayName="Shared With" ma:internalName="SharedWithUsers" ma:readOnly="true">
       <xsd:complexType>
         <xsd:complexContent>
           <xsd:extension base="dms:UserMulti">
@@ -6495,14 +6712,14 @@
         </xsd:complexContent>
       </xsd:complexType>
     </xsd:element>
-    <xsd:element name="SharedWithDetails" ma:index="13" nillable="true" ma:displayName="Shared With Details" ma:internalName="SharedWithDetails" ma:readOnly="true">
+    <xsd:element name="SharedWithDetails" ma:index="16" nillable="true" ma:displayName="Shared With Details" ma:internalName="SharedWithDetails" ma:readOnly="true">
       <xsd:simpleType>
         <xsd:restriction base="dms:Note">
           <xsd:maxLength value="255"/>
         </xsd:restriction>
       </xsd:simpleType>
     </xsd:element>
-    <xsd:element name="TaxCatchAll" ma:index="25" nillable="true" ma:displayName="Taxonomy Catch All Column" ma:hidden="true" ma:list="{80935f1f-9d5f-4b6d-8dba-ca4f0d380f96}" ma:internalName="TaxCatchAll" ma:showField="CatchAllData" ma:web="468815d5-cb9c-47f5-a02e-1e231035b2f5">
+    <xsd:element name="TaxCatchAll" ma:index="20" nillable="true" ma:displayName="Taxonomy Catch All Column" ma:hidden="true" ma:list="{21058b11-7069-4e64-920a-e42f03a7a0bd}" ma:internalName="TaxCatchAll" ma:showField="CatchAllData" ma:web="3b0546f9-1591-425f-a5ce-577a0197cd82">
       <xsd:complexType>
         <xsd:complexContent>
           <xsd:extension base="dms:MultiChoiceLookup">
@@ -6624,29 +6841,23 @@
 <file path=customXml/itemProps2.xml><?xml version="1.0" encoding="utf-8"?>
 <ds:datastoreItem xmlns:ds="http://schemas.openxmlformats.org/officeDocument/2006/customXml" ds:itemID="{2CB38153-5319-4411-A4F1-100AE80E3828}">
   <ds:schemaRefs>
-    <ds:schemaRef ds:uri="http://schemas.microsoft.com/office/2006/documentManagement/types"/>
-    <ds:schemaRef ds:uri="88ecf5b8-9820-43d8-9ca8-4b0ec3b93c38"/>
-    <ds:schemaRef ds:uri="http://purl.org/dc/elements/1.1/"/>
     <ds:schemaRef ds:uri="http://schemas.microsoft.com/office/2006/metadata/properties"/>
-    <ds:schemaRef ds:uri="http://purl.org/dc/terms/"/>
-    <ds:schemaRef ds:uri="http://schemas.openxmlformats.org/package/2006/metadata/core-properties"/>
     <ds:schemaRef ds:uri="http://schemas.microsoft.com/office/infopath/2007/PartnerControls"/>
-    <ds:schemaRef ds:uri="468815d5-cb9c-47f5-a02e-1e231035b2f5"/>
-    <ds:schemaRef ds:uri="http://www.w3.org/XML/1998/namespace"/>
-    <ds:schemaRef ds:uri="http://purl.org/dc/dcmitype/"/>
+    <ds:schemaRef ds:uri="3b0546f9-1591-425f-a5ce-577a0197cd82"/>
+    <ds:schemaRef ds:uri="184593b7-ad5e-4fec-b620-657070b7e511"/>
   </ds:schemaRefs>
 </ds:datastoreItem>
 </file>
 
 <file path=customXml/itemProps3.xml><?xml version="1.0" encoding="utf-8"?>
-<ds:datastoreItem xmlns:ds="http://schemas.openxmlformats.org/officeDocument/2006/customXml" ds:itemID="{82C02CD0-9918-4AE3-A17E-32E8B1952265}">
+<ds:datastoreItem xmlns:ds="http://schemas.openxmlformats.org/officeDocument/2006/customXml" ds:itemID="{544E857E-378A-414F-81B0-848D019A7DDC}">
   <ds:schemaRefs>
     <ds:schemaRef ds:uri="http://schemas.microsoft.com/office/2006/metadata/contentType"/>
     <ds:schemaRef ds:uri="http://schemas.microsoft.com/office/2006/metadata/properties/metaAttributes"/>
     <ds:schemaRef ds:uri="http://www.w3.org/2001/XMLSchema"/>
     <ds:schemaRef ds:uri="http://schemas.microsoft.com/office/2006/metadata/properties"/>
-    <ds:schemaRef ds:uri="88ecf5b8-9820-43d8-9ca8-4b0ec3b93c38"/>
-    <ds:schemaRef ds:uri="468815d5-cb9c-47f5-a02e-1e231035b2f5"/>
+    <ds:schemaRef ds:uri="184593b7-ad5e-4fec-b620-657070b7e511"/>
+    <ds:schemaRef ds:uri="3b0546f9-1591-425f-a5ce-577a0197cd82"/>
     <ds:schemaRef ds:uri="http://schemas.microsoft.com/office/2006/documentManagement/types"/>
     <ds:schemaRef ds:uri="http://schemas.microsoft.com/office/infopath/2007/PartnerControls"/>
     <ds:schemaRef ds:uri="http://schemas.openxmlformats.org/package/2006/metadata/core-properties"/>

</xml_diff>